<commit_message>
Docs: Complete Guide, Presentation Walkthrough, User Guide/White Paper/File Index updates
Co-Authored-By: Claude Fable 5.1 <noreply@anthropic.com>
Claude-Session: https://claude.ai/code/session_01JPZJaTbXQFN2qiYRf4rkZK
</commit_message>
<xml_diff>
--- a/docs/Next_Owner_Market_File_Index.docx
+++ b/docs/Next_Owner_Market_File_Index.docx
@@ -821,6 +821,32 @@
       </w:pPr>
       <w:r>
         <w:t xml:space="preserve">User Guide and White Paper were updated the same day (What's New / Sept 30 addendum).</w:t>
+      </w:r>
+    </w:p>
+    <w:p>
+      <w:pPr>
+        <w:pStyle w:val="BodyText"/>
+      </w:pPr>
+      <w:r>
+        <w:t xml:space="preserve">| 14 | Next_Owner_Market_Complete_Guide.docx | Everything the site is, page by page, what runs by itself, how it grows, trust, costs, where things are kept |</w:t>
+      </w:r>
+      <w:r>
+        <w:t xml:space="preserve"> </w:t>
+      </w:r>
+      <w:r>
+        <w:t xml:space="preserve">| 15 | Next_Owner_Market_Presentation_Walkthrough.docx | A 14-slide script for presenting the site to anyone, with every address |</w:t>
+      </w:r>
+      <w:r>
+        <w:t xml:space="preserve"> </w:t>
+      </w:r>
+      <w:r>
+        <w:t xml:space="preserve">| 16 | Next_Owner_Market_Mission_Statement.docx | Why we built this, full and short versions |</w:t>
+      </w:r>
+      <w:r>
+        <w:t xml:space="preserve"> </w:t>
+      </w:r>
+      <w:r>
+        <w:t xml:space="preserve">| 17 | Next_Owner_Market_AddOn_Modules_White_Paper.docx | The add-on modules research paper with status (four of six built) |</w:t>
       </w:r>
     </w:p>
     <w:bookmarkEnd w:id="20"/>

</xml_diff>

<commit_message>
File Index: current set
Co-Authored-By: Claude Fable 5.1 <noreply@anthropic.com>
Claude-Session: https://claude.ai/code/session_01JPZJaTbXQFN2qiYRf4rkZK
</commit_message>
<xml_diff>
--- a/docs/Next_Owner_Market_File_Index.docx
+++ b/docs/Next_Owner_Market_File_Index.docx
@@ -2,7 +2,7 @@
 <file path=word/document.xml><?xml version="1.0" encoding="utf-8"?>
 <w:document xmlns:w="http://schemas.openxmlformats.org/wordprocessingml/2006/main" xmlns:m="http://schemas.openxmlformats.org/officeDocument/2006/math" xmlns:r="http://schemas.openxmlformats.org/officeDocument/2006/relationships" xmlns:o="urn:schemas-microsoft-com:office:office" xmlns:v="urn:schemas-microsoft-com:vml" xmlns:w10="urn:schemas-microsoft-com:office:word" xmlns:a="http://schemas.openxmlformats.org/drawingml/2006/main" xmlns:pic="http://schemas.openxmlformats.org/drawingml/2006/picture" xmlns:wp="http://schemas.openxmlformats.org/drawingml/2006/wordprocessingDrawing">
   <w:body>
-    <w:bookmarkStart w:id="21" w:name="next-owner-market--file-index"/>
+    <w:bookmarkStart w:id="20" w:name="next-owner-market--file-index"/>
     <w:p>
       <w:pPr>
         <w:pStyle w:val="Heading1"/>
@@ -20,7 +20,7 @@
           <w:iCs/>
           <w:i/>
         </w:rPr>
-        <w:t xml:space="preserve">Complete set as of September 30, 2026, 1:45 AM. Everything earlier is superseded; delete it.</w:t>
+        <w:t xml:space="preserve">The complete, current set. September 30, 2026 (night). Replace every older copy with these; same names, newest wins. Delete anything not on this list (the old Marketing_Plan and Facebook_Group_Handoff are folded into the Tool Marketing Plan and Launch Kit).</w:t>
       </w:r>
     </w:p>
     <w:tbl>
@@ -84,7 +84,7 @@
               <w:jc w:val="left"/>
             </w:pPr>
             <w:r>
-              <w:t xml:space="preserve">Changes?</w:t>
+              <w:t xml:space="preserve">Changes when</w:t>
             </w:r>
           </w:p>
         </w:tc>
@@ -110,31 +110,31 @@
               <w:jc w:val="left"/>
             </w:pPr>
             <w:r>
-              <w:t xml:space="preserve">Next_Owner_Market_White_Paper.docx</w:t>
-            </w:r>
-          </w:p>
-        </w:tc>
-        <w:tc>
-          <w:tcPr/>
-          <w:p>
-            <w:pPr>
-              <w:pStyle w:val="Compact"/>
-              <w:jc w:val="left"/>
-            </w:pPr>
-            <w:r>
-              <w:t xml:space="preserve">Full build record: accounts, keys (where they live, not the values), architecture, database, rebuild-from-nothing steps, day-to-day ops, roadmap</w:t>
-            </w:r>
-          </w:p>
-        </w:tc>
-        <w:tc>
-          <w:tcPr/>
-          <w:p>
-            <w:pPr>
-              <w:pStyle w:val="Compact"/>
-              <w:jc w:val="left"/>
-            </w:pPr>
-            <w:r>
-              <w:t xml:space="preserve">Updated whenever the app changes</w:t>
+              <w:t xml:space="preserve">Next_Owner_Market_Complete_Guide.docx</w:t>
+            </w:r>
+          </w:p>
+        </w:tc>
+        <w:tc>
+          <w:tcPr/>
+          <w:p>
+            <w:pPr>
+              <w:pStyle w:val="Compact"/>
+              <w:jc w:val="left"/>
+            </w:pPr>
+            <w:r>
+              <w:t xml:space="preserve">Everything: what the site is, every public page and app screen (where, how to get there, what, why), what runs by itself, how it grows, trust, costs, where things are kept, the Operations page explained</w:t>
+            </w:r>
+          </w:p>
+        </w:tc>
+        <w:tc>
+          <w:tcPr/>
+          <w:p>
+            <w:pPr>
+              <w:pStyle w:val="Compact"/>
+              <w:jc w:val="left"/>
+            </w:pPr>
+            <w:r>
+              <w:t xml:space="preserve">Whenever the app changes</w:t>
             </w:r>
           </w:p>
         </w:tc>
@@ -160,31 +160,31 @@
               <w:jc w:val="left"/>
             </w:pPr>
             <w:r>
-              <w:t xml:space="preserve">Next_Owner_Market_User_Guide.docx</w:t>
-            </w:r>
-          </w:p>
-        </w:tc>
-        <w:tc>
-          <w:tcPr/>
-          <w:p>
-            <w:pPr>
-              <w:pStyle w:val="Compact"/>
-              <w:jc w:val="left"/>
-            </w:pPr>
-            <w:r>
-              <w:t xml:space="preserve">Instruction book: every screen, button, and feature; buyers, sellers, staff; consignment terms; trust and safety</w:t>
-            </w:r>
-          </w:p>
-        </w:tc>
-        <w:tc>
-          <w:tcPr/>
-          <w:p>
-            <w:pPr>
-              <w:pStyle w:val="Compact"/>
-              <w:jc w:val="left"/>
-            </w:pPr>
-            <w:r>
-              <w:t xml:space="preserve">Updated whenever the app changes</w:t>
+              <w:t xml:space="preserve">Next_Owner_Market_Presentation_Walkthrough.docx</w:t>
+            </w:r>
+          </w:p>
+        </w:tc>
+        <w:tc>
+          <w:tcPr/>
+          <w:p>
+            <w:pPr>
+              <w:pStyle w:val="Compact"/>
+              <w:jc w:val="left"/>
+            </w:pPr>
+            <w:r>
+              <w:t xml:space="preserve">A 14-slide script for presenting the site to anyone, what to show and say, plus every address in one table</w:t>
+            </w:r>
+          </w:p>
+        </w:tc>
+        <w:tc>
+          <w:tcPr/>
+          <w:p>
+            <w:pPr>
+              <w:pStyle w:val="Compact"/>
+              <w:jc w:val="left"/>
+            </w:pPr>
+            <w:r>
+              <w:t xml:space="preserve">Whenever the app changes</w:t>
             </w:r>
           </w:p>
         </w:tc>
@@ -210,31 +210,31 @@
               <w:jc w:val="left"/>
             </w:pPr>
             <w:r>
-              <w:t xml:space="preserve">Next_Owner_Market_Launch_Kit.docx</w:t>
-            </w:r>
-          </w:p>
-        </w:tc>
-        <w:tc>
-          <w:tcPr/>
-          <w:p>
-            <w:pPr>
-              <w:pStyle w:val="Compact"/>
-              <w:jc w:val="left"/>
-            </w:pPr>
-            <w:r>
-              <w:t xml:space="preserve">30-day launch plan: demo video, where to post, creator outreach, calendar, targets</w:t>
-            </w:r>
-          </w:p>
-        </w:tc>
-        <w:tc>
-          <w:tcPr/>
-          <w:p>
-            <w:pPr>
-              <w:pStyle w:val="Compact"/>
-              <w:jc w:val="left"/>
-            </w:pPr>
-            <w:r>
-              <w:t xml:space="preserve">Stable</w:t>
+              <w:t xml:space="preserve">Next_Owner_Market_User_Guide.docx</w:t>
+            </w:r>
+          </w:p>
+        </w:tc>
+        <w:tc>
+          <w:tcPr/>
+          <w:p>
+            <w:pPr>
+              <w:pStyle w:val="Compact"/>
+              <w:jc w:val="left"/>
+            </w:pPr>
+            <w:r>
+              <w:t xml:space="preserve">The instruction book for buyers, sellers and staff, screen by screen, with What's New sections</w:t>
+            </w:r>
+          </w:p>
+        </w:tc>
+        <w:tc>
+          <w:tcPr/>
+          <w:p>
+            <w:pPr>
+              <w:pStyle w:val="Compact"/>
+              <w:jc w:val="left"/>
+            </w:pPr>
+            <w:r>
+              <w:t xml:space="preserve">Whenever the app changes</w:t>
             </w:r>
           </w:p>
         </w:tc>
@@ -260,31 +260,31 @@
               <w:jc w:val="left"/>
             </w:pPr>
             <w:r>
-              <w:t xml:space="preserve">Next_Owner_Market_Marketing_Plan.docx</w:t>
-            </w:r>
-          </w:p>
-        </w:tc>
-        <w:tc>
-          <w:tcPr/>
-          <w:p>
-            <w:pPr>
-              <w:pStyle w:val="Compact"/>
-              <w:jc w:val="left"/>
-            </w:pPr>
-            <w:r>
-              <w:t xml:space="preserve">Longer-range marketing and growth plan</w:t>
-            </w:r>
-          </w:p>
-        </w:tc>
-        <w:tc>
-          <w:tcPr/>
-          <w:p>
-            <w:pPr>
-              <w:pStyle w:val="Compact"/>
-              <w:jc w:val="left"/>
-            </w:pPr>
-            <w:r>
-              <w:t xml:space="preserve">Stable</w:t>
+              <w:t xml:space="preserve">Next_Owner_Market_White_Paper.docx</w:t>
+            </w:r>
+          </w:p>
+        </w:tc>
+        <w:tc>
+          <w:tcPr/>
+          <w:p>
+            <w:pPr>
+              <w:pStyle w:val="Compact"/>
+              <w:jc w:val="left"/>
+            </w:pPr>
+            <w:r>
+              <w:t xml:space="preserve">Technical build record: architecture, database, keys (where they live), rebuild steps, addenda</w:t>
+            </w:r>
+          </w:p>
+        </w:tc>
+        <w:tc>
+          <w:tcPr/>
+          <w:p>
+            <w:pPr>
+              <w:pStyle w:val="Compact"/>
+              <w:jc w:val="left"/>
+            </w:pPr>
+            <w:r>
+              <w:t xml:space="preserve">Whenever the app changes</w:t>
             </w:r>
           </w:p>
         </w:tc>
@@ -310,31 +310,31 @@
               <w:jc w:val="left"/>
             </w:pPr>
             <w:r>
-              <w:t xml:space="preserve">Next_Owner_Market_Seller_Terms.docx</w:t>
-            </w:r>
-          </w:p>
-        </w:tc>
-        <w:tc>
-          <w:tcPr/>
-          <w:p>
-            <w:pPr>
-              <w:pStyle w:val="Compact"/>
-              <w:jc w:val="left"/>
-            </w:pPr>
-            <w:r>
-              <w:t xml:space="preserve">Plain-language seller and buyer terms, draft for a lawyer</w:t>
-            </w:r>
-          </w:p>
-        </w:tc>
-        <w:tc>
-          <w:tcPr/>
-          <w:p>
-            <w:pPr>
-              <w:pStyle w:val="Compact"/>
-              <w:jc w:val="left"/>
-            </w:pPr>
-            <w:r>
-              <w:t xml:space="preserve">Stable until reviewed</w:t>
+              <w:t xml:space="preserve">Next_Owner_Market_Mission_Statement.docx</w:t>
+            </w:r>
+          </w:p>
+        </w:tc>
+        <w:tc>
+          <w:tcPr/>
+          <w:p>
+            <w:pPr>
+              <w:pStyle w:val="Compact"/>
+              <w:jc w:val="left"/>
+            </w:pPr>
+            <w:r>
+              <w:t xml:space="preserve">Why we built this, full and short versions, in the owner's voice</w:t>
+            </w:r>
+          </w:p>
+        </w:tc>
+        <w:tc>
+          <w:tcPr/>
+          <w:p>
+            <w:pPr>
+              <w:pStyle w:val="Compact"/>
+              <w:jc w:val="left"/>
+            </w:pPr>
+            <w:r>
+              <w:t xml:space="preserve">When the owner adds to it</w:t>
             </w:r>
           </w:p>
         </w:tc>
@@ -360,19 +360,19 @@
               <w:jc w:val="left"/>
             </w:pPr>
             <w:r>
-              <w:t xml:space="preserve">Next_Owner_Market_Share_Message.docx</w:t>
-            </w:r>
-          </w:p>
-        </w:tc>
-        <w:tc>
-          <w:tcPr/>
-          <w:p>
-            <w:pPr>
-              <w:pStyle w:val="Compact"/>
-              <w:jc w:val="left"/>
-            </w:pPr>
-            <w:r>
-              <w:t xml:space="preserve">The announcement to send people</w:t>
+              <w:t xml:space="preserve">Next_Owner_Market_Tool_Marketing_Plan.docx</w:t>
+            </w:r>
+          </w:p>
+        </w:tc>
+        <w:tc>
+          <w:tcPr/>
+          <w:p>
+            <w:pPr>
+              <w:pStyle w:val="Compact"/>
+              <w:jc w:val="left"/>
+            </w:pPr>
+            <w:r>
+              <w:t xml:space="preserve">Getting eBay/Poshmark/Mercari/Facebook/Etsy sellers to use the tool: where, what to say, content, creators, search, 60-day cadence</w:t>
             </w:r>
           </w:p>
         </w:tc>
@@ -410,19 +410,19 @@
               <w:jc w:val="left"/>
             </w:pPr>
             <w:r>
-              <w:t xml:space="preserve">Facebook_Group_Handoff.docx</w:t>
-            </w:r>
-          </w:p>
-        </w:tc>
-        <w:tc>
-          <w:tcPr/>
-          <w:p>
-            <w:pPr>
-              <w:pStyle w:val="Compact"/>
-              <w:jc w:val="left"/>
-            </w:pPr>
-            <w:r>
-              <w:t xml:space="preserve">The Facebook group plan</w:t>
+              <w:t xml:space="preserve">Next_Owner_Market_Launch_Kit.docx</w:t>
+            </w:r>
+          </w:p>
+        </w:tc>
+        <w:tc>
+          <w:tcPr/>
+          <w:p>
+            <w:pPr>
+              <w:pStyle w:val="Compact"/>
+              <w:jc w:val="left"/>
+            </w:pPr>
+            <w:r>
+              <w:t xml:space="preserve">30-day launch: demo video, groups, creators, Product Hunt, calendar, targets</w:t>
             </w:r>
           </w:p>
         </w:tc>
@@ -460,31 +460,31 @@
               <w:jc w:val="left"/>
             </w:pPr>
             <w:r>
-              <w:t xml:space="preserve">Record_and_Turntable_Refurbish.docx</w:t>
-            </w:r>
-          </w:p>
-        </w:tc>
-        <w:tc>
-          <w:tcPr/>
-          <w:p>
-            <w:pPr>
-              <w:pStyle w:val="Compact"/>
-              <w:jc w:val="left"/>
-            </w:pPr>
-            <w:r>
-              <w:t xml:space="preserve">Turntable and vinyl cleaning checklist</w:t>
-            </w:r>
-          </w:p>
-        </w:tc>
-        <w:tc>
-          <w:tcPr/>
-          <w:p>
-            <w:pPr>
-              <w:pStyle w:val="Compact"/>
-              <w:jc w:val="left"/>
-            </w:pPr>
-            <w:r>
-              <w:t xml:space="preserve">Stable</w:t>
+              <w:t xml:space="preserve">Next_Owner_Market_AddOn_Modules_White_Paper.docx</w:t>
+            </w:r>
+          </w:p>
+        </w:tc>
+        <w:tc>
+          <w:tcPr/>
+          <w:p>
+            <w:pPr>
+              <w:pStyle w:val="Compact"/>
+              <w:jc w:val="left"/>
+            </w:pPr>
+            <w:r>
+              <w:t xml:space="preserve">The add-on modules research paper, with status (four of six built)</w:t>
+            </w:r>
+          </w:p>
+        </w:tc>
+        <w:tc>
+          <w:tcPr/>
+          <w:p>
+            <w:pPr>
+              <w:pStyle w:val="Compact"/>
+              <w:jc w:val="left"/>
+            </w:pPr>
+            <w:r>
+              <w:t xml:space="preserve">When modules change</w:t>
             </w:r>
           </w:p>
         </w:tc>
@@ -510,19 +510,19 @@
               <w:jc w:val="left"/>
             </w:pPr>
             <w:r>
-              <w:t xml:space="preserve">Their_Record_Outreach_Plan.docx</w:t>
-            </w:r>
-          </w:p>
-        </w:tc>
-        <w:tc>
-          <w:tcPr/>
-          <w:p>
-            <w:pPr>
-              <w:pStyle w:val="Compact"/>
-              <w:jc w:val="left"/>
-            </w:pPr>
-            <w:r>
-              <w:t xml:space="preserve">Belongs to the Their Record project; kept here as well</w:t>
+              <w:t xml:space="preserve">Next_Owner_Market_Seller_Terms.docx</w:t>
+            </w:r>
+          </w:p>
+        </w:tc>
+        <w:tc>
+          <w:tcPr/>
+          <w:p>
+            <w:pPr>
+              <w:pStyle w:val="Compact"/>
+              <w:jc w:val="left"/>
+            </w:pPr>
+            <w:r>
+              <w:t xml:space="preserve">Seller terms</w:t>
             </w:r>
           </w:p>
         </w:tc>
@@ -560,31 +560,31 @@
               <w:jc w:val="left"/>
             </w:pPr>
             <w:r>
-              <w:t xml:space="preserve">next-owner-market-source.zip</w:t>
-            </w:r>
-          </w:p>
-        </w:tc>
-        <w:tc>
-          <w:tcPr/>
-          <w:p>
-            <w:pPr>
-              <w:pStyle w:val="Compact"/>
-              <w:jc w:val="left"/>
-            </w:pPr>
-            <w:r>
-              <w:t xml:space="preserve">Complete source code and database migrations as of this date (also on GitHub, wholesale30/next-owner-market)</w:t>
-            </w:r>
-          </w:p>
-        </w:tc>
-        <w:tc>
-          <w:tcPr/>
-          <w:p>
-            <w:pPr>
-              <w:pStyle w:val="Compact"/>
-              <w:jc w:val="left"/>
-            </w:pPr>
-            <w:r>
-              <w:t xml:space="preserve">Replace after big changes</w:t>
+              <w:t xml:space="preserve">Next_Owner_Market_Share_Message.docx</w:t>
+            </w:r>
+          </w:p>
+        </w:tc>
+        <w:tc>
+          <w:tcPr/>
+          <w:p>
+            <w:pPr>
+              <w:pStyle w:val="Compact"/>
+              <w:jc w:val="left"/>
+            </w:pPr>
+            <w:r>
+              <w:t xml:space="preserve">Ready-to-send announcement</w:t>
+            </w:r>
+          </w:p>
+        </w:tc>
+        <w:tc>
+          <w:tcPr/>
+          <w:p>
+            <w:pPr>
+              <w:pStyle w:val="Compact"/>
+              <w:jc w:val="left"/>
+            </w:pPr>
+            <w:r>
+              <w:t xml:space="preserve">Stable</w:t>
             </w:r>
           </w:p>
         </w:tc>
@@ -610,6 +610,106 @@
               <w:jc w:val="left"/>
             </w:pPr>
             <w:r>
+              <w:t xml:space="preserve">Next_Owner_Market_Build_Journal.docx</w:t>
+            </w:r>
+          </w:p>
+        </w:tc>
+        <w:tc>
+          <w:tcPr/>
+          <w:p>
+            <w:pPr>
+              <w:pStyle w:val="Compact"/>
+              <w:jc w:val="left"/>
+            </w:pPr>
+            <w:r>
+              <w:t xml:space="preserve">Every conversation, verbatim, for the book</w:t>
+            </w:r>
+          </w:p>
+        </w:tc>
+        <w:tc>
+          <w:tcPr/>
+          <w:p>
+            <w:pPr>
+              <w:pStyle w:val="Compact"/>
+              <w:jc w:val="left"/>
+            </w:pPr>
+            <w:r>
+              <w:t xml:space="preserve">Every session</w:t>
+            </w:r>
+          </w:p>
+        </w:tc>
+      </w:tr>
+      <w:tr>
+        <w:tc>
+          <w:tcPr/>
+          <w:p>
+            <w:pPr>
+              <w:pStyle w:val="Compact"/>
+              <w:jc w:val="left"/>
+            </w:pPr>
+            <w:r>
+              <w:t xml:space="preserve">12</w:t>
+            </w:r>
+          </w:p>
+        </w:tc>
+        <w:tc>
+          <w:tcPr/>
+          <w:p>
+            <w:pPr>
+              <w:pStyle w:val="Compact"/>
+              <w:jc w:val="left"/>
+            </w:pPr>
+            <w:r>
+              <w:t xml:space="preserve">Next_Owner_Market_Change_Log.docx</w:t>
+            </w:r>
+          </w:p>
+        </w:tc>
+        <w:tc>
+          <w:tcPr/>
+          <w:p>
+            <w:pPr>
+              <w:pStyle w:val="Compact"/>
+              <w:jc w:val="left"/>
+            </w:pPr>
+            <w:r>
+              <w:t xml:space="preserve">Every change to the code and docs, when, what, which files</w:t>
+            </w:r>
+          </w:p>
+        </w:tc>
+        <w:tc>
+          <w:tcPr/>
+          <w:p>
+            <w:pPr>
+              <w:pStyle w:val="Compact"/>
+              <w:jc w:val="left"/>
+            </w:pPr>
+            <w:r>
+              <w:t xml:space="preserve">Every session</w:t>
+            </w:r>
+          </w:p>
+        </w:tc>
+      </w:tr>
+      <w:tr>
+        <w:tc>
+          <w:tcPr/>
+          <w:p>
+            <w:pPr>
+              <w:pStyle w:val="Compact"/>
+              <w:jc w:val="left"/>
+            </w:pPr>
+            <w:r>
+              <w:t xml:space="preserve">13</w:t>
+            </w:r>
+          </w:p>
+        </w:tc>
+        <w:tc>
+          <w:tcPr/>
+          <w:p>
+            <w:pPr>
+              <w:pStyle w:val="Compact"/>
+              <w:jc w:val="left"/>
+            </w:pPr>
+            <w:r>
               <w:t xml:space="preserve">Next_Owner_Market_File_Index.docx</w:t>
             </w:r>
           </w:p>
@@ -634,7 +734,157 @@
               <w:jc w:val="left"/>
             </w:pPr>
             <w:r>
-              <w:t xml:space="preserve">—</w:t>
+              <w:t xml:space="preserve">When files are added</w:t>
+            </w:r>
+          </w:p>
+        </w:tc>
+      </w:tr>
+      <w:tr>
+        <w:tc>
+          <w:tcPr/>
+          <w:p>
+            <w:pPr>
+              <w:pStyle w:val="Compact"/>
+              <w:jc w:val="left"/>
+            </w:pPr>
+            <w:r>
+              <w:t xml:space="preserve">14</w:t>
+            </w:r>
+          </w:p>
+        </w:tc>
+        <w:tc>
+          <w:tcPr/>
+          <w:p>
+            <w:pPr>
+              <w:pStyle w:val="Compact"/>
+              <w:jc w:val="left"/>
+            </w:pPr>
+            <w:r>
+              <w:t xml:space="preserve">Their_Record_Outreach_Plan.docx</w:t>
+            </w:r>
+          </w:p>
+        </w:tc>
+        <w:tc>
+          <w:tcPr/>
+          <w:p>
+            <w:pPr>
+              <w:pStyle w:val="Compact"/>
+              <w:jc w:val="left"/>
+            </w:pPr>
+            <w:r>
+              <w:t xml:space="preserve">Outreach plan for the Their Record project (separate project)</w:t>
+            </w:r>
+          </w:p>
+        </w:tc>
+        <w:tc>
+          <w:tcPr/>
+          <w:p>
+            <w:pPr>
+              <w:pStyle w:val="Compact"/>
+              <w:jc w:val="left"/>
+            </w:pPr>
+            <w:r>
+              <w:t xml:space="preserve">Stable</w:t>
+            </w:r>
+          </w:p>
+        </w:tc>
+      </w:tr>
+      <w:tr>
+        <w:tc>
+          <w:tcPr/>
+          <w:p>
+            <w:pPr>
+              <w:pStyle w:val="Compact"/>
+              <w:jc w:val="left"/>
+            </w:pPr>
+            <w:r>
+              <w:t xml:space="preserve">15</w:t>
+            </w:r>
+          </w:p>
+        </w:tc>
+        <w:tc>
+          <w:tcPr/>
+          <w:p>
+            <w:pPr>
+              <w:pStyle w:val="Compact"/>
+              <w:jc w:val="left"/>
+            </w:pPr>
+            <w:r>
+              <w:t xml:space="preserve">Record_and_Turntable_Refurbish.docx</w:t>
+            </w:r>
+          </w:p>
+        </w:tc>
+        <w:tc>
+          <w:tcPr/>
+          <w:p>
+            <w:pPr>
+              <w:pStyle w:val="Compact"/>
+              <w:jc w:val="left"/>
+            </w:pPr>
+            <w:r>
+              <w:t xml:space="preserve">Turntable restoration guide (separate)</w:t>
+            </w:r>
+          </w:p>
+        </w:tc>
+        <w:tc>
+          <w:tcPr/>
+          <w:p>
+            <w:pPr>
+              <w:pStyle w:val="Compact"/>
+              <w:jc w:val="left"/>
+            </w:pPr>
+            <w:r>
+              <w:t xml:space="preserve">Stable</w:t>
+            </w:r>
+          </w:p>
+        </w:tc>
+      </w:tr>
+      <w:tr>
+        <w:tc>
+          <w:tcPr/>
+          <w:p>
+            <w:pPr>
+              <w:pStyle w:val="Compact"/>
+              <w:jc w:val="left"/>
+            </w:pPr>
+            <w:r>
+              <w:t xml:space="preserve">16</w:t>
+            </w:r>
+          </w:p>
+        </w:tc>
+        <w:tc>
+          <w:tcPr/>
+          <w:p>
+            <w:pPr>
+              <w:pStyle w:val="Compact"/>
+              <w:jc w:val="left"/>
+            </w:pPr>
+            <w:r>
+              <w:t xml:space="preserve">next-owner-market-source.zip</w:t>
+            </w:r>
+          </w:p>
+        </w:tc>
+        <w:tc>
+          <w:tcPr/>
+          <w:p>
+            <w:pPr>
+              <w:pStyle w:val="Compact"/>
+              <w:jc w:val="left"/>
+            </w:pPr>
+            <w:r>
+              <w:t xml:space="preserve">Source code snapshot (the live code is on GitHub; this is a convenience copy and may lag)</w:t>
+            </w:r>
+          </w:p>
+        </w:tc>
+        <w:tc>
+          <w:tcPr/>
+          <w:p>
+            <w:pPr>
+              <w:pStyle w:val="Compact"/>
+              <w:jc w:val="left"/>
+            </w:pPr>
+            <w:r>
+              <w:t xml:space="preserve">On request</w:t>
             </w:r>
           </w:p>
         </w:tc>
@@ -645,212 +895,40 @@
         <w:pStyle w:val="BodyText"/>
       </w:pPr>
       <w:r>
-        <w:rPr>
-          <w:bCs/>
-          <w:b/>
-        </w:rPr>
-        <w:t xml:space="preserve">Secrets are not in any file.</w:t>
+        <w:t xml:space="preserve">Operating rules for working with Claude: the</w:t>
       </w:r>
       <w:r>
         <w:t xml:space="preserve"> </w:t>
       </w:r>
       <w:r>
-        <w:t xml:space="preserve">The Stripe secret key, Resend key, Supabase secret key, and Anthropic key live only in Vercel (Project → Settings → Environment Variables). If ever lost, each is regenerated in its own dashboard and pasted back into Vercel; nothing else changes. The Stripe account's 2-step sign-in uses the passkey on the Z Fold 6.</w:t>
-      </w:r>
-    </w:p>
-    <w:p>
-      <w:pPr>
-        <w:pStyle w:val="BodyText"/>
-      </w:pPr>
-      <w:r>
         <w:rPr>
-          <w:bCs/>
-          <w:b/>
+          <w:rStyle w:val="VerbatimChar"/>
         </w:rPr>
-        <w:t xml:space="preserve">Live addresses:</w:t>
+        <w:t xml:space="preserve">shayne-operating-rules</w:t>
       </w:r>
       <w:r>
         <w:t xml:space="preserve"> </w:t>
       </w:r>
       <w:r>
-        <w:t xml:space="preserve">store nextownermarket.com · Pro page nextownermarket.com/pro · staff sign-in nextownermarket.com/login · sell sign-up nextownermarket.com/signup · buyer sign-up nextownermarket.com/signup?buyer=1</w:t>
-      </w:r>
-    </w:p>
-    <w:bookmarkStart w:id="20" w:name="added-september-30"/>
-    <w:p>
-      <w:pPr>
-        <w:pStyle w:val="Heading2"/>
-      </w:pPr>
-      <w:r>
-        <w:t xml:space="preserve">Added September 30</w:t>
-      </w:r>
-    </w:p>
-    <w:tbl>
-      <w:tblPr>
-        <w:tblStyle w:val="Table"/>
-        <w:tblW w:type="auto" w:w="0"/>
-        <w:tblLook w:firstRow="1" w:lastRow="0" w:firstColumn="0" w:lastColumn="0" w:noHBand="0" w:noVBand="0" w:val="0020"/>
-        <w:jc w:val="start"/>
-      </w:tblPr>
-      <w:tblGrid>
-        <w:gridCol w:w="2640"/>
-        <w:gridCol w:w="2640"/>
-        <w:gridCol w:w="2640"/>
-      </w:tblGrid>
-      <w:tr>
-        <w:trPr>
-          <w:tblHeader w:val="true"/>
-        </w:trPr>
-        <w:tc>
-          <w:tcPr/>
-          <w:p>
-            <w:pPr>
-              <w:pStyle w:val="Compact"/>
-              <w:jc w:val="left"/>
-            </w:pPr>
-            <w:r>
-              <w:t xml:space="preserve">#</w:t>
-            </w:r>
-          </w:p>
-        </w:tc>
-        <w:tc>
-          <w:tcPr/>
-          <w:p>
-            <w:pPr>
-              <w:pStyle w:val="Compact"/>
-              <w:jc w:val="left"/>
-            </w:pPr>
-            <w:r>
-              <w:t xml:space="preserve">File</w:t>
-            </w:r>
-          </w:p>
-        </w:tc>
-        <w:tc>
-          <w:tcPr/>
-          <w:p>
-            <w:pPr>
-              <w:pStyle w:val="Compact"/>
-              <w:jc w:val="left"/>
-            </w:pPr>
-            <w:r>
-              <w:t xml:space="preserve">What it is</w:t>
-            </w:r>
-          </w:p>
-        </w:tc>
-      </w:tr>
-      <w:tr>
-        <w:tc>
-          <w:tcPr/>
-          <w:p>
-            <w:pPr>
-              <w:pStyle w:val="Compact"/>
-              <w:jc w:val="left"/>
-            </w:pPr>
-            <w:r>
-              <w:t xml:space="preserve">12</w:t>
-            </w:r>
-          </w:p>
-        </w:tc>
-        <w:tc>
-          <w:tcPr/>
-          <w:p>
-            <w:pPr>
-              <w:pStyle w:val="Compact"/>
-              <w:jc w:val="left"/>
-            </w:pPr>
-            <w:r>
-              <w:t xml:space="preserve">Next_Owner_Market_Tool_Marketing_Plan.docx</w:t>
-            </w:r>
-          </w:p>
-        </w:tc>
-        <w:tc>
-          <w:tcPr/>
-          <w:p>
-            <w:pPr>
-              <w:pStyle w:val="Compact"/>
-              <w:jc w:val="left"/>
-            </w:pPr>
-            <w:r>
-              <w:t xml:space="preserve">Getting sellers on eBay/Poshmark/Mercari/Facebook/Etsy to use the AI tool: per-platform where and what to say, content, creators, search, 60-day cadence</w:t>
-            </w:r>
-          </w:p>
-        </w:tc>
-      </w:tr>
-      <w:tr>
-        <w:tc>
-          <w:tcPr/>
-          <w:p>
-            <w:pPr>
-              <w:pStyle w:val="Compact"/>
-              <w:jc w:val="left"/>
-            </w:pPr>
-            <w:r>
-              <w:t xml:space="preserve">13</w:t>
-            </w:r>
-          </w:p>
-        </w:tc>
-        <w:tc>
-          <w:tcPr/>
-          <w:p>
-            <w:pPr>
-              <w:pStyle w:val="Compact"/>
-              <w:jc w:val="left"/>
-            </w:pPr>
-            <w:r>
-              <w:t xml:space="preserve">Next_Owner_Market_Build_Journal.docx</w:t>
-            </w:r>
-          </w:p>
-        </w:tc>
-        <w:tc>
-          <w:tcPr/>
-          <w:p>
-            <w:pPr>
-              <w:pStyle w:val="Compact"/>
-              <w:jc w:val="left"/>
-            </w:pPr>
-            <w:r>
-              <w:t xml:space="preserve">The complete chronological record of the build conversation: every request, every correction, what was built</w:t>
-            </w:r>
-          </w:p>
-        </w:tc>
-      </w:tr>
-    </w:tbl>
-    <w:p>
-      <w:pPr>
-        <w:pStyle w:val="BodyText"/>
-      </w:pPr>
-      <w:r>
-        <w:t xml:space="preserve">User Guide and White Paper were updated the same day (What's New / Sept 30 addendum).</w:t>
-      </w:r>
-    </w:p>
-    <w:p>
-      <w:pPr>
-        <w:pStyle w:val="BodyText"/>
-      </w:pPr>
-      <w:r>
-        <w:t xml:space="preserve">| 14 | Next_Owner_Market_Complete_Guide.docx | Everything the site is, page by page, what runs by itself, how it grows, trust, costs, where things are kept |</w:t>
+        <w:t xml:space="preserve">skill on the Claude account (every chat, every project) and</w:t>
       </w:r>
       <w:r>
         <w:t xml:space="preserve"> </w:t>
       </w:r>
       <w:r>
-        <w:t xml:space="preserve">| 15 | Next_Owner_Market_Presentation_Walkthrough.docx | A 14-slide script for presenting the site to anyone, with every address |</w:t>
+        <w:rPr>
+          <w:rStyle w:val="VerbatimChar"/>
+        </w:rPr>
+        <w:t xml:space="preserve">CLAUDE.md</w:t>
       </w:r>
       <w:r>
         <w:t xml:space="preserve"> </w:t>
       </w:r>
       <w:r>
-        <w:t xml:space="preserve">| 16 | Next_Owner_Market_Mission_Statement.docx | Why we built this, full and short versions |</w:t>
-      </w:r>
-      <w:r>
-        <w:t xml:space="preserve"> </w:t>
-      </w:r>
-      <w:r>
-        <w:t xml:space="preserve">| 17 | Next_Owner_Market_AddOn_Modules_White_Paper.docx | The add-on modules research paper with status (four of six built) |</w:t>
+        <w:t xml:space="preserve">in the code.</w:t>
       </w:r>
     </w:p>
     <w:bookmarkEnd w:id="20"/>
-    <w:bookmarkEnd w:id="21"/>
     <w:sectPr/>
   </w:body>
 </w:document>

</xml_diff>

<commit_message>
Pro membership cost review
Co-Authored-By: Claude Opus 5.5 <noreply@anthropic.com>
Claude-Session: https://claude.ai/code/session_01JPZJaTbXQFN2qiYRf4rkZK
</commit_message>
<xml_diff>
--- a/docs/Next_Owner_Market_File_Index.docx
+++ b/docs/Next_Owner_Market_File_Index.docx
@@ -32,49 +32,7 @@
           <w:iCs/>
           <w:i/>
         </w:rPr>
-        <w:t xml:space="preserve">Not mixed in: the</w:t>
-      </w:r>
-      <w:r>
-        <w:rPr>
-          <w:iCs/>
-          <w:i/>
-        </w:rPr>
-        <w:t xml:space="preserve"> </w:t>
-      </w:r>
-      <w:r>
-        <w:rPr>
-          <w:iCs/>
-          <w:i/>
-        </w:rPr>
-        <w:t xml:space="preserve">“</w:t>
-      </w:r>
-      <w:r>
-        <w:rPr>
-          <w:iCs/>
-          <w:i/>
-        </w:rPr>
-        <w:t xml:space="preserve">Their Record</w:t>
-      </w:r>
-      <w:r>
-        <w:rPr>
-          <w:iCs/>
-          <w:i/>
-        </w:rPr>
-        <w:t xml:space="preserve">”</w:t>
-      </w:r>
-      <w:r>
-        <w:rPr>
-          <w:iCs/>
-          <w:i/>
-        </w:rPr>
-        <w:t xml:space="preserve"> </w:t>
-      </w:r>
-      <w:r>
-        <w:rPr>
-          <w:iCs/>
-          <w:i/>
-        </w:rPr>
-        <w:t xml:space="preserve">political project and the turntable restoration guide. Those are separate projects. The website’s code lives safely on GitHub (wholesale30/next-owner-market), so it isn’t in here.</w:t>
+        <w:t xml:space="preserve">Not mixed in: the "Their Record" political project and the turntable restoration guide. Those are separate projects. The website's code lives safely on GitHub (wholesale30/next-owner-market), so it isn't in here.</w:t>
       </w:r>
     </w:p>
     <w:bookmarkStart w:id="20" w:name="start-here"/>
@@ -89,7 +47,7 @@
     <w:tbl>
       <w:tblPr>
         <w:tblStyle w:val="Table"/>
-        <w:tblW w:type="pct" w:w="5000"/>
+        <w:tblW w:type="auto" w:w="0"/>
         <w:tblLook w:firstRow="1" w:lastRow="0" w:firstColumn="0" w:lastColumn="0" w:noHBand="0" w:noVBand="0" w:val="0020"/>
         <w:jc w:val="start"/>
       </w:tblPr>
@@ -267,7 +225,7 @@
     <w:tbl>
       <w:tblPr>
         <w:tblStyle w:val="Table"/>
-        <w:tblW w:type="pct" w:w="5000"/>
+        <w:tblW w:type="auto" w:w="0"/>
         <w:tblLook w:firstRow="1" w:lastRow="0" w:firstColumn="0" w:lastColumn="0" w:noHBand="0" w:noVBand="0" w:val="0020"/>
         <w:jc w:val="start"/>
       </w:tblPr>
@@ -407,7 +365,7 @@
     <w:tbl>
       <w:tblPr>
         <w:tblStyle w:val="Table"/>
-        <w:tblW w:type="pct" w:w="5000"/>
+        <w:tblW w:type="auto" w:w="0"/>
         <w:tblLook w:firstRow="1" w:lastRow="0" w:firstColumn="0" w:lastColumn="0" w:noHBand="0" w:noVBand="0" w:val="0020"/>
         <w:jc w:val="start"/>
       </w:tblPr>
@@ -604,7 +562,7 @@
               <w:jc w:val="left"/>
             </w:pPr>
             <w:r>
-              <w:t xml:space="preserve">Technical build record: how it’s built and how to rebuild it</w:t>
+              <w:t xml:space="preserve">Technical build record: how it's built and how to rebuild it</w:t>
             </w:r>
           </w:p>
         </w:tc>
@@ -661,7 +619,7 @@
     <w:tbl>
       <w:tblPr>
         <w:tblStyle w:val="Table"/>
-        <w:tblW w:type="pct" w:w="5000"/>
+        <w:tblW w:type="auto" w:w="0"/>
         <w:tblLook w:firstRow="1" w:lastRow="0" w:firstColumn="0" w:lastColumn="0" w:noHBand="0" w:noVBand="0" w:val="0020"/>
         <w:jc w:val="start"/>
       </w:tblPr>
@@ -953,7 +911,7 @@
     <w:tbl>
       <w:tblPr>
         <w:tblStyle w:val="Table"/>
-        <w:tblW w:type="pct" w:w="5000"/>
+        <w:tblW w:type="auto" w:w="0"/>
         <w:tblLook w:firstRow="1" w:lastRow="0" w:firstColumn="0" w:lastColumn="0" w:noHBand="0" w:noVBand="0" w:val="0020"/>
         <w:jc w:val="start"/>
       </w:tblPr>
@@ -1080,6 +1038,25 @@
         </w:tc>
       </w:tr>
     </w:tbl>
+    <w:p>
+      <w:pPr>
+        <w:numPr>
+          <w:ilvl w:val="0"/>
+          <w:numId w:val="1001"/>
+        </w:numPr>
+        <w:pStyle w:val="Compact"/>
+      </w:pPr>
+      <w:r>
+        <w:rPr>
+          <w:bCs/>
+          <w:b/>
+        </w:rPr>
+        <w:t xml:space="preserve">Next_Owner_Market_Pro_Membership_Cost_Review.docx</w:t>
+      </w:r>
+      <w:r>
+        <w:t xml:space="preserve">: what every feature costs us per use, what one $15 Pro member costs at light, typical and heavy use, the free-side exposure, the fixed bills coming, and the recommended allowance, top-ups and cost cuts (Oct 2, 2026).</w:t>
+      </w:r>
+    </w:p>
     <w:bookmarkEnd w:id="24"/>
     <w:bookmarkEnd w:id="25"/>
     <w:sectPr/>
@@ -1188,8 +1165,87 @@
       </w:pPr>
     </w:lvl>
   </w:abstractNum>
+  <w:abstractNum w:abstractNumId="991">
+    <w:nsid w:val="A991"/>
+    <w:multiLevelType w:val="multilevel"/>
+    <w:lvl w:ilvl="0">
+      <w:numFmt w:val="bullet"/>
+      <w:lvlText w:val="•"/>
+      <w:lvlJc w:val="left"/>
+      <w:pPr>
+        <w:ind w:left="720" w:hanging="480"/>
+      </w:pPr>
+    </w:lvl>
+    <w:lvl w:ilvl="1">
+      <w:numFmt w:val="bullet"/>
+      <w:lvlText w:val="–"/>
+      <w:lvlJc w:val="left"/>
+      <w:pPr>
+        <w:ind w:left="1440" w:hanging="480"/>
+      </w:pPr>
+    </w:lvl>
+    <w:lvl w:ilvl="2">
+      <w:numFmt w:val="bullet"/>
+      <w:lvlText w:val="•"/>
+      <w:lvlJc w:val="left"/>
+      <w:pPr>
+        <w:ind w:left="2160" w:hanging="480"/>
+      </w:pPr>
+    </w:lvl>
+    <w:lvl w:ilvl="3">
+      <w:numFmt w:val="bullet"/>
+      <w:lvlText w:val="–"/>
+      <w:lvlJc w:val="left"/>
+      <w:pPr>
+        <w:ind w:left="2880" w:hanging="480"/>
+      </w:pPr>
+    </w:lvl>
+    <w:lvl w:ilvl="4">
+      <w:numFmt w:val="bullet"/>
+      <w:lvlText w:val="•"/>
+      <w:lvlJc w:val="left"/>
+      <w:pPr>
+        <w:ind w:left="3600" w:hanging="480"/>
+      </w:pPr>
+    </w:lvl>
+    <w:lvl w:ilvl="5">
+      <w:numFmt w:val="bullet"/>
+      <w:lvlText w:val="–"/>
+      <w:lvlJc w:val="left"/>
+      <w:pPr>
+        <w:ind w:left="4320" w:hanging="480"/>
+      </w:pPr>
+    </w:lvl>
+    <w:lvl w:ilvl="6">
+      <w:numFmt w:val="bullet"/>
+      <w:lvlText w:val="•"/>
+      <w:lvlJc w:val="left"/>
+      <w:pPr>
+        <w:ind w:left="5040" w:hanging="480"/>
+      </w:pPr>
+    </w:lvl>
+    <w:lvl w:ilvl="7">
+      <w:numFmt w:val="bullet"/>
+      <w:lvlText w:val="–"/>
+      <w:lvlJc w:val="left"/>
+      <w:pPr>
+        <w:ind w:left="5760" w:hanging="480"/>
+      </w:pPr>
+    </w:lvl>
+    <w:lvl w:ilvl="8">
+      <w:numFmt w:val="bullet"/>
+      <w:lvlText w:val="•"/>
+      <w:lvlJc w:val="left"/>
+      <w:pPr>
+        <w:ind w:left="6480" w:hanging="480"/>
+      </w:pPr>
+    </w:lvl>
+  </w:abstractNum>
   <w:num w:numId="1000">
     <w:abstractNumId w:val="990"/>
+  </w:num>
+  <w:num w:numId="1001">
+    <w:abstractNumId w:val="991"/>
   </w:num>
 </w:numbering>
 </file>

</xml_diff>